<commit_message>
docs: atualiza fluxo (MES + SIM/NAO), base, manual e planilha P1-P4
</commit_message>
<xml_diff>
--- a/data/documentos/Manual_Procedimentos_Suporte_SAP.docx
+++ b/data/documentos/Manual_Procedimentos_Suporte_SAP.docx
@@ -64,7 +64,7 @@
           <w:sz w:val="20"/>
           <w:szCs w:val="20"/>
         </w:rPr>
-        <w:t xml:space="preserve">Documento interno • Versão 2.0 • Julho/2026</w:t>
+        <w:t xml:space="preserve">Documento interno • Versão 2.1 • Julho/2026</w:t>
       </w:r>
     </w:p>
     <w:p>
@@ -123,7 +123,7 @@
           <w:sz w:val="22"/>
           <w:szCs w:val="22"/>
         </w:rPr>
-        <w:t xml:space="preserve">Este manual define o processo padrão de atendimento de suporte aos sistemas SAP da Orla_Tech Consultoria. Ele orienta colaboradores e o agente de inteligência artificial sobre como registrar, classificar e encaminhar solicitações, garantindo agilidade e rastreabilidade. O foco principal é o módulo MM (Materials Management); os demais módulos (PP, QM, WM) e as integrações com os sistemas MES (Opcenter e PAS-X) são tratados de forma geral.</w:t>
+        <w:t xml:space="preserve">Este manual define o processo padrão de atendimento de suporte aos sistemas SAP da Orla_Tech Consultoria. Orienta colaboradores e o agente de IA (um especialista SAP virtual) sobre como registrar, classificar e encaminhar solicitações, garantindo agilidade e rastreabilidade. O foco é o módulo MM; os demais (PP, QM, WM) e as integrações MES (Opcenter e PAS-X) são tratados de forma geral.</w:t>
       </w:r>
     </w:p>
     <w:p>
@@ -145,7 +145,7 @@
           <w:sz w:val="22"/>
           <w:szCs w:val="22"/>
         </w:rPr>
-        <w:t xml:space="preserve">O suporte cobre incidentes, dúvidas e solicitações relacionadas aos processos abaixo, tanto no ambiente SAP ECC quanto no SAP S/4HANA:</w:t>
+        <w:t xml:space="preserve">O suporte cobre incidentes e dúvidas dos processos abaixo, nos ambientes SAP ECC e S/4HANA:</w:t>
       </w:r>
     </w:p>
     <w:p>
@@ -162,7 +162,7 @@
           <w:sz w:val="22"/>
           <w:szCs w:val="22"/>
         </w:rPr>
-        <w:t xml:space="preserve">SAP MM (foco): pedidos de compra, entrada de mercadoria, faturas, mestre de materiais, estoques, contratos e registros info.</w:t>
+        <w:t xml:space="preserve">SAP MM (foco): pedidos, entrada de mercadoria, faturas, mestre de materiais, estoques, contratos.</w:t>
       </w:r>
     </w:p>
     <w:p>
@@ -213,7 +213,7 @@
           <w:sz w:val="22"/>
           <w:szCs w:val="22"/>
         </w:rPr>
-        <w:t xml:space="preserve">SAP WM: ordens de transferência, picking e inventário de depósito.</w:t>
+        <w:t xml:space="preserve">SAP WM: ordens de transferência, picking e inventário.</w:t>
       </w:r>
     </w:p>
     <w:p>
@@ -230,7 +230,7 @@
           <w:sz w:val="22"/>
           <w:szCs w:val="22"/>
         </w:rPr>
-        <w:t xml:space="preserve">Integrações MES: replicação de ordens e apontamentos com Opcenter (Siemens) e PAS-X (Werum).</w:t>
+        <w:t xml:space="preserve">Integrações MES: replicação de ordens e apontamentos com Opcenter e PAS-X.</w:t>
       </w:r>
     </w:p>
     <w:p>
@@ -252,7 +252,7 @@
           <w:sz w:val="22"/>
           <w:szCs w:val="22"/>
         </w:rPr>
-        <w:t xml:space="preserve">O atendimento segue o fluxo abaixo. O colaborador consulta o agente de IA; se a resposta estiver na base de conhecimento, o agente responde com a solução. Caso contrário, o agente informa que não possui aquele conhecimento, explica que é necessária a validação humana e pergunta ao usuário se deseja abrir um chamado. Somente após a confirmação, o chamado é criado no ServiceToday.</w:t>
+        <w:t xml:space="preserve">O colaborador consulta o agente; se a resposta estiver na base, o agente responde com a solução e cita a fonte. Caso contrário, contorna cordialmente, recomenda o portal e oferece registrar um chamado no ServiceToday, escolhendo a ferramenta (SAP/MES), com o módulo detectado automaticamente e prioridade P1-P4.</w:t>
       </w:r>
     </w:p>
     <w:p>
@@ -263,9 +263,9 @@
       <w:r>
         <w:drawing>
           <wp:inline distT="0" distB="0" distL="0" distR="0">
-            <wp:extent cx="5143500" cy="3429000"/>
+            <wp:extent cx="5334000" cy="3552825"/>
             <wp:effectExtent t="0" r="0" b="0" l="0"/>
-            <wp:docPr id="1" name="fluxo" descr="Fluxo de suporte SAP Orla_Tech" title="Fluxo de atendimento"/>
+            <wp:docPr id="1" name="fluxo" descr="Fluxo de suporte SAP Orla_Tech" title="Fluxo"/>
             <wp:cNvGraphicFramePr>
               <a:graphicFrameLocks xmlns:a="http://schemas.openxmlformats.org/drawingml/2006/main" noChangeAspect="1"/>
             </wp:cNvGraphicFramePr>
@@ -288,7 +288,7 @@
                   <pic:spPr bwMode="auto">
                     <a:xfrm>
                       <a:off x="0" y="0"/>
-                      <a:ext cx="5143500" cy="3429000"/>
+                      <a:ext cx="5334000" cy="3552825"/>
                     </a:xfrm>
                     <a:prstGeom prst="rect">
                       <a:avLst/>
@@ -306,7 +306,106 @@
         <w:pStyle w:val="Heading1"/>
       </w:pPr>
       <w:r>
-        <w:t xml:space="preserve">4. Comportamento do agente quando NÃO sabe a resposta</w:t>
+        <w:t xml:space="preserve">4. Comportamento do agente quando NÃO sabe</w:t>
+      </w:r>
+    </w:p>
+    <w:p>
+      <w:pPr>
+        <w:spacing w:after="120"/>
+        <w:jc w:val="both"/>
+      </w:pPr>
+      <w:r>
+        <w:rPr>
+          <w:rFonts w:ascii="Arial" w:cs="Arial" w:eastAsia="Arial" w:hAnsi="Arial"/>
+          <w:sz w:val="22"/>
+          <w:szCs w:val="22"/>
+        </w:rPr>
+        <w:t xml:space="preserve">Para garantir precisão, o agente nunca inventa. Quando a informação não está na base:</w:t>
+      </w:r>
+    </w:p>
+    <w:p>
+      <w:pPr>
+        <w:pStyle w:val="ListParagraph"/>
+        <w:numPr>
+          <w:ilvl w:val="0"/>
+          <w:numId w:val="3"/>
+        </w:numPr>
+      </w:pPr>
+      <w:r>
+        <w:rPr>
+          <w:rFonts w:ascii="Arial" w:cs="Arial" w:eastAsia="Arial" w:hAnsi="Arial"/>
+          <w:sz w:val="22"/>
+          <w:szCs w:val="22"/>
+        </w:rPr>
+        <w:t xml:space="preserve">Informa de forma cordial que não localizou a informação na base atual.</w:t>
+      </w:r>
+    </w:p>
+    <w:p>
+      <w:pPr>
+        <w:pStyle w:val="ListParagraph"/>
+        <w:numPr>
+          <w:ilvl w:val="0"/>
+          <w:numId w:val="3"/>
+        </w:numPr>
+      </w:pPr>
+      <w:r>
+        <w:rPr>
+          <w:rFonts w:ascii="Arial" w:cs="Arial" w:eastAsia="Arial" w:hAnsi="Arial"/>
+          <w:sz w:val="22"/>
+          <w:szCs w:val="22"/>
+        </w:rPr>
+        <w:t xml:space="preserve">Recomenda consultar os documentos disponibilizados no portal da companhia.</w:t>
+      </w:r>
+    </w:p>
+    <w:p>
+      <w:pPr>
+        <w:pStyle w:val="ListParagraph"/>
+        <w:numPr>
+          <w:ilvl w:val="0"/>
+          <w:numId w:val="3"/>
+        </w:numPr>
+      </w:pPr>
+      <w:r>
+        <w:rPr>
+          <w:rFonts w:ascii="Arial" w:cs="Arial" w:eastAsia="Arial" w:hAnsi="Arial"/>
+          <w:sz w:val="22"/>
+          <w:szCs w:val="22"/>
+        </w:rPr>
+        <w:t xml:space="preserve">Oferece registrar um chamado e pergunta a ferramenta: SAP ou MES.</w:t>
+      </w:r>
+    </w:p>
+    <w:p>
+      <w:pPr>
+        <w:pStyle w:val="ListParagraph"/>
+        <w:numPr>
+          <w:ilvl w:val="0"/>
+          <w:numId w:val="3"/>
+        </w:numPr>
+      </w:pPr>
+      <w:r>
+        <w:rPr>
+          <w:rFonts w:ascii="Arial" w:cs="Arial" w:eastAsia="Arial" w:hAnsi="Arial"/>
+          <w:sz w:val="22"/>
+          <w:szCs w:val="22"/>
+        </w:rPr>
+        <w:t xml:space="preserve">Detecta automaticamente o módulo (MM/PP/QM/WM/MES) pelo texto do problema.</w:t>
+      </w:r>
+    </w:p>
+    <w:p>
+      <w:pPr>
+        <w:pStyle w:val="ListParagraph"/>
+        <w:numPr>
+          <w:ilvl w:val="0"/>
+          <w:numId w:val="3"/>
+        </w:numPr>
+      </w:pPr>
+      <w:r>
+        <w:rPr>
+          <w:rFonts w:ascii="Arial" w:cs="Arial" w:eastAsia="Arial" w:hAnsi="Arial"/>
+          <w:sz w:val="22"/>
+          <w:szCs w:val="22"/>
+        </w:rPr>
+        <w:t xml:space="preserve">Pergunta a prioridade (P1 a P4) e cria o chamado com número sequencial único.</w:t>
       </w:r>
     </w:p>
     <w:p>
@@ -325,111 +424,7 @@
           <w:sz w:val="22"/>
           <w:szCs w:val="22"/>
         </w:rPr>
-        <w:t xml:space="preserve">Para garantir precisão, o agente nunca inventa respostas. Quando a informação não está na base de conhecimento, ele adota o seguinte comportamento padrão:</w:t>
-      </w:r>
-    </w:p>
-    <w:p>
-      <w:pPr>
-        <w:pStyle w:val="ListParagraph"/>
-        <w:numPr>
-          <w:ilvl w:val="0"/>
-          <w:numId w:val="3"/>
-        </w:numPr>
-      </w:pPr>
-      <w:r>
-        <w:rPr>
-          <w:rFonts w:ascii="Arial" w:cs="Arial" w:eastAsia="Arial" w:hAnsi="Arial"/>
-          <w:sz w:val="22"/>
-          <w:szCs w:val="22"/>
-        </w:rPr>
-        <w:t xml:space="preserve">Informa educadamente que não possui aquele conhecimento em sua base.</w:t>
-      </w:r>
-    </w:p>
-    <w:p>
-      <w:pPr>
-        <w:pStyle w:val="ListParagraph"/>
-        <w:numPr>
-          <w:ilvl w:val="0"/>
-          <w:numId w:val="3"/>
-        </w:numPr>
-      </w:pPr>
-      <w:r>
-        <w:rPr>
-          <w:rFonts w:ascii="Arial" w:cs="Arial" w:eastAsia="Arial" w:hAnsi="Arial"/>
-          <w:sz w:val="22"/>
-          <w:szCs w:val="22"/>
-        </w:rPr>
-        <w:t xml:space="preserve">Explica que o caso exige validação de um especialista humano.</w:t>
-      </w:r>
-    </w:p>
-    <w:p>
-      <w:pPr>
-        <w:pStyle w:val="ListParagraph"/>
-        <w:numPr>
-          <w:ilvl w:val="0"/>
-          <w:numId w:val="3"/>
-        </w:numPr>
-      </w:pPr>
-      <w:r>
-        <w:rPr>
-          <w:rFonts w:ascii="Arial" w:cs="Arial" w:eastAsia="Arial" w:hAnsi="Arial"/>
-          <w:sz w:val="22"/>
-          <w:szCs w:val="22"/>
-        </w:rPr>
-        <w:t xml:space="preserve">Pergunta ao usuário: “Deseja que eu abra um chamado no ServiceToday?”</w:t>
-      </w:r>
-    </w:p>
-    <w:p>
-      <w:pPr>
-        <w:pStyle w:val="ListParagraph"/>
-        <w:numPr>
-          <w:ilvl w:val="0"/>
-          <w:numId w:val="3"/>
-        </w:numPr>
-      </w:pPr>
-      <w:r>
-        <w:rPr>
-          <w:rFonts w:ascii="Arial" w:cs="Arial" w:eastAsia="Arial" w:hAnsi="Arial"/>
-          <w:sz w:val="22"/>
-          <w:szCs w:val="22"/>
-        </w:rPr>
-        <w:t xml:space="preserve">Somente após a confirmação do usuário, gera um número de chamado sequencial único (o próximo após o último registrado).</w:t>
-      </w:r>
-    </w:p>
-    <w:p>
-      <w:pPr>
-        <w:pStyle w:val="ListParagraph"/>
-        <w:numPr>
-          <w:ilvl w:val="0"/>
-          <w:numId w:val="3"/>
-        </w:numPr>
-      </w:pPr>
-      <w:r>
-        <w:rPr>
-          <w:rFonts w:ascii="Arial" w:cs="Arial" w:eastAsia="Arial" w:hAnsi="Arial"/>
-          <w:sz w:val="22"/>
-          <w:szCs w:val="22"/>
-        </w:rPr>
-        <w:t xml:space="preserve">Registra o chamado na base e devolve o número (INC00XXXXX) ao usuário.</w:t>
-      </w:r>
-    </w:p>
-    <w:p>
-      <w:pPr>
-        <w:spacing w:after="120"/>
-        <w:jc w:val="both"/>
-      </w:pPr>
-      <w:r>
-        <w:rPr>
-          <w:rFonts w:ascii="Arial" w:cs="Arial" w:eastAsia="Arial" w:hAnsi="Arial"/>
-          <w:b w:val="false"/>
-          <w:bCs w:val="false"/>
-          <w:i w:val="false"/>
-          <w:iCs w:val="false"/>
-          <w:color w:val="000000"/>
-          <w:sz w:val="22"/>
-          <w:szCs w:val="22"/>
-        </w:rPr>
-        <w:t xml:space="preserve">Exemplo de resposta do agente: </w:t>
+        <w:t xml:space="preserve">Exemplo: </w:t>
       </w:r>
       <w:r>
         <w:rPr>
@@ -442,7 +437,7 @@
           <w:sz w:val="22"/>
           <w:szCs w:val="22"/>
         </w:rPr>
-        <w:t xml:space="preserve">“Não encontrei essa informação na base de conhecimento e ela precisa de validação humana. Deseja que eu abra um chamado no ServiceToday? (sim/não)”</w:t>
+        <w:t xml:space="preserve">“Não localizei essa informação na base atual. Recomendo consultar o portal da companhia. Posso registrar um chamado — deseja? Se sim, para qual ferramenta: SAP ou MES?”</w:t>
       </w:r>
     </w:p>
     <w:p>
@@ -450,7 +445,7 @@
         <w:pStyle w:val="Heading1"/>
       </w:pPr>
       <w:r>
-        <w:t xml:space="preserve">5. Abertura de chamado no ServiceToday</w:t>
+        <w:t xml:space="preserve">5. Níveis de incidente — prioridade e SLA</w:t>
       </w:r>
     </w:p>
     <w:p>
@@ -461,151 +456,10 @@
       <w:r>
         <w:rPr>
           <w:rFonts w:ascii="Arial" w:cs="Arial" w:eastAsia="Arial" w:hAnsi="Arial"/>
-          <w:b w:val="false"/>
-          <w:bCs w:val="false"/>
-          <w:i w:val="false"/>
-          <w:iCs w:val="false"/>
-          <w:color w:val="000000"/>
-          <w:sz w:val="22"/>
-          <w:szCs w:val="22"/>
-        </w:rPr>
-        <w:t xml:space="preserve">Após a confirmação do usuário, o chamado é aberto na ferramenta </w:t>
-      </w:r>
-      <w:r>
-        <w:rPr>
-          <w:rFonts w:ascii="Arial" w:cs="Arial" w:eastAsia="Arial" w:hAnsi="Arial"/>
-          <w:b/>
-          <w:bCs/>
-          <w:i w:val="false"/>
-          <w:iCs w:val="false"/>
-          <w:color w:val="000000"/>
-          <w:sz w:val="22"/>
-          <w:szCs w:val="22"/>
-        </w:rPr>
-        <w:t xml:space="preserve">ServiceToday</w:t>
-      </w:r>
-      <w:r>
-        <w:rPr>
-          <w:rFonts w:ascii="Arial" w:cs="Arial" w:eastAsia="Arial" w:hAnsi="Arial"/>
-          <w:b w:val="false"/>
-          <w:bCs w:val="false"/>
-          <w:i w:val="false"/>
-          <w:iCs w:val="false"/>
-          <w:color w:val="000000"/>
-          <w:sz w:val="22"/>
-          <w:szCs w:val="22"/>
-        </w:rPr>
-        <w:t xml:space="preserve"> (central de serviços corporativa) com os dados coletados. Passos executados:</w:t>
-      </w:r>
-    </w:p>
-    <w:p>
-      <w:pPr>
-        <w:pStyle w:val="ListParagraph"/>
-        <w:numPr>
-          <w:ilvl w:val="0"/>
-          <w:numId w:val="3"/>
-        </w:numPr>
-      </w:pPr>
-      <w:r>
-        <w:rPr>
-          <w:rFonts w:ascii="Arial" w:cs="Arial" w:eastAsia="Arial" w:hAnsi="Arial"/>
-          <w:sz w:val="22"/>
-          <w:szCs w:val="22"/>
-        </w:rPr>
-        <w:t xml:space="preserve">Selecionar o catálogo “Suporte SAP”.</w:t>
-      </w:r>
-    </w:p>
-    <w:p>
-      <w:pPr>
-        <w:pStyle w:val="ListParagraph"/>
-        <w:numPr>
-          <w:ilvl w:val="0"/>
-          <w:numId w:val="3"/>
-        </w:numPr>
-      </w:pPr>
-      <w:r>
-        <w:rPr>
-          <w:rFonts w:ascii="Arial" w:cs="Arial" w:eastAsia="Arial" w:hAnsi="Arial"/>
-          <w:sz w:val="22"/>
-          <w:szCs w:val="22"/>
-        </w:rPr>
-        <w:t xml:space="preserve">Definir a categoria: SAP MM, SAP PP, SAP QM, SAP WM ou Integração/MES.</w:t>
-      </w:r>
-    </w:p>
-    <w:p>
-      <w:pPr>
-        <w:pStyle w:val="ListParagraph"/>
-        <w:numPr>
-          <w:ilvl w:val="0"/>
-          <w:numId w:val="3"/>
-        </w:numPr>
-      </w:pPr>
-      <w:r>
-        <w:rPr>
-          <w:rFonts w:ascii="Arial" w:cs="Arial" w:eastAsia="Arial" w:hAnsi="Arial"/>
-          <w:sz w:val="22"/>
-          <w:szCs w:val="22"/>
-        </w:rPr>
-        <w:t xml:space="preserve">Informar o sistema afetado (ECC ou S/4HANA).</w:t>
-      </w:r>
-    </w:p>
-    <w:p>
-      <w:pPr>
-        <w:pStyle w:val="ListParagraph"/>
-        <w:numPr>
-          <w:ilvl w:val="0"/>
-          <w:numId w:val="3"/>
-        </w:numPr>
-      </w:pPr>
-      <w:r>
-        <w:rPr>
-          <w:rFonts w:ascii="Arial" w:cs="Arial" w:eastAsia="Arial" w:hAnsi="Arial"/>
-          <w:sz w:val="22"/>
-          <w:szCs w:val="22"/>
-        </w:rPr>
-        <w:t xml:space="preserve">Registrar transação, número do documento, mensagem de erro e prints.</w:t>
-      </w:r>
-    </w:p>
-    <w:p>
-      <w:pPr>
-        <w:pStyle w:val="ListParagraph"/>
-        <w:numPr>
-          <w:ilvl w:val="0"/>
-          <w:numId w:val="3"/>
-        </w:numPr>
-      </w:pPr>
-      <w:r>
-        <w:rPr>
-          <w:rFonts w:ascii="Arial" w:cs="Arial" w:eastAsia="Arial" w:hAnsi="Arial"/>
-          <w:sz w:val="22"/>
-          <w:szCs w:val="22"/>
-        </w:rPr>
-        <w:t xml:space="preserve">Definir a prioridade conforme o impacto.</w:t>
-      </w:r>
-    </w:p>
-    <w:p>
-      <w:pPr>
-        <w:pStyle w:val="ListParagraph"/>
-        <w:numPr>
-          <w:ilvl w:val="0"/>
-          <w:numId w:val="3"/>
-        </w:numPr>
-      </w:pPr>
-      <w:r>
-        <w:rPr>
-          <w:rFonts w:ascii="Arial" w:cs="Arial" w:eastAsia="Arial" w:hAnsi="Arial"/>
-          <w:sz w:val="22"/>
-          <w:szCs w:val="22"/>
-        </w:rPr>
-        <w:t xml:space="preserve">Gerar o número sequencial único e registrar na base de chamados.</w:t>
-      </w:r>
-    </w:p>
-    <w:p>
-      <w:pPr>
-        <w:pStyle w:val="Heading1"/>
-      </w:pPr>
-      <w:r>
-        <w:t xml:space="preserve">6. Classificação de prioridade e SLA</w:t>
+          <w:sz w:val="22"/>
+          <w:szCs w:val="22"/>
+        </w:rPr>
+        <w:t xml:space="preserve">Todo chamado é classificado em um dos quatro níveis de prioridade abaixo, que determinam o SLA (tempo de atendimento):</w:t>
       </w:r>
     </w:p>
     <w:tbl>
@@ -621,8 +475,8 @@
         </w:tblBorders>
       </w:tblPr>
       <w:tblGrid>
-        <w:gridCol w:w="1800"/>
-        <w:gridCol w:w="5160"/>
+        <w:gridCol w:w="2200"/>
+        <w:gridCol w:w="4760"/>
         <w:gridCol w:w="2400"/>
       </w:tblGrid>
       <w:tr>
@@ -631,7 +485,7 @@
         </w:trPr>
         <w:tc>
           <w:tcPr>
-            <w:tcW w:type="dxa" w:w="1800"/>
+            <w:tcW w:type="dxa" w:w="2200"/>
             <w:tcBorders>
               <w:top w:val="single" w:color="CCCCCC" w:sz="1"/>
               <w:left w:val="single" w:color="CCCCCC" w:sz="1"/>
@@ -656,13 +510,13 @@
                 <w:sz w:val="20"/>
                 <w:szCs w:val="20"/>
               </w:rPr>
-              <w:t xml:space="preserve">Prioridade</w:t>
-            </w:r>
-          </w:p>
-        </w:tc>
-        <w:tc>
-          <w:tcPr>
-            <w:tcW w:type="dxa" w:w="5160"/>
+              <w:t xml:space="preserve">Nível</w:t>
+            </w:r>
+          </w:p>
+        </w:tc>
+        <w:tc>
+          <w:tcPr>
+            <w:tcW w:type="dxa" w:w="4760"/>
             <w:tcBorders>
               <w:top w:val="single" w:color="CCCCCC" w:sz="1"/>
               <w:left w:val="single" w:color="CCCCCC" w:sz="1"/>
@@ -726,14 +580,14 @@
       <w:tr>
         <w:tc>
           <w:tcPr>
-            <w:tcW w:type="dxa" w:w="1800"/>
-            <w:tcBorders>
-              <w:top w:val="single" w:color="CCCCCC" w:sz="1"/>
-              <w:left w:val="single" w:color="CCCCCC" w:sz="1"/>
-              <w:bottom w:val="single" w:color="CCCCCC" w:sz="1"/>
-              <w:right w:val="single" w:color="CCCCCC" w:sz="1"/>
-            </w:tcBorders>
-            <w:shd w:fill="F8CBAD" w:val="clear"/>
+            <w:tcW w:type="dxa" w:w="2200"/>
+            <w:tcBorders>
+              <w:top w:val="single" w:color="CCCCCC" w:sz="1"/>
+              <w:left w:val="single" w:color="CCCCCC" w:sz="1"/>
+              <w:bottom w:val="single" w:color="CCCCCC" w:sz="1"/>
+              <w:right w:val="single" w:color="CCCCCC" w:sz="1"/>
+            </w:tcBorders>
+            <w:shd w:fill="F4B183" w:val="clear"/>
             <w:tcMar>
               <w:top w:type="dxa" w:w="80"/>
               <w:left w:type="dxa" w:w="120"/>
@@ -751,13 +605,13 @@
                 <w:sz w:val="20"/>
                 <w:szCs w:val="20"/>
               </w:rPr>
-              <w:t xml:space="preserve">Alta</w:t>
-            </w:r>
-          </w:p>
-        </w:tc>
-        <w:tc>
-          <w:tcPr>
-            <w:tcW w:type="dxa" w:w="5160"/>
+              <w:t xml:space="preserve">P1 - Crítico</w:t>
+            </w:r>
+          </w:p>
+        </w:tc>
+        <w:tc>
+          <w:tcPr>
+            <w:tcW w:type="dxa" w:w="4760"/>
             <w:tcBorders>
               <w:top w:val="single" w:color="CCCCCC" w:sz="1"/>
               <w:left w:val="single" w:color="CCCCCC" w:sz="1"/>
@@ -811,7 +665,7 @@
                 <w:sz w:val="20"/>
                 <w:szCs w:val="20"/>
               </w:rPr>
-              <w:t xml:space="preserve">8 horas</w:t>
+              <w:t xml:space="preserve">4 horas</w:t>
             </w:r>
           </w:p>
         </w:tc>
@@ -819,14 +673,14 @@
       <w:tr>
         <w:tc>
           <w:tcPr>
-            <w:tcW w:type="dxa" w:w="1800"/>
-            <w:tcBorders>
-              <w:top w:val="single" w:color="CCCCCC" w:sz="1"/>
-              <w:left w:val="single" w:color="CCCCCC" w:sz="1"/>
-              <w:bottom w:val="single" w:color="CCCCCC" w:sz="1"/>
-              <w:right w:val="single" w:color="CCCCCC" w:sz="1"/>
-            </w:tcBorders>
-            <w:shd w:fill="FFE699" w:val="clear"/>
+            <w:tcW w:type="dxa" w:w="2200"/>
+            <w:tcBorders>
+              <w:top w:val="single" w:color="CCCCCC" w:sz="1"/>
+              <w:left w:val="single" w:color="CCCCCC" w:sz="1"/>
+              <w:bottom w:val="single" w:color="CCCCCC" w:sz="1"/>
+              <w:right w:val="single" w:color="CCCCCC" w:sz="1"/>
+            </w:tcBorders>
+            <w:shd w:fill="F8CBAD" w:val="clear"/>
             <w:tcMar>
               <w:top w:type="dxa" w:w="80"/>
               <w:left w:type="dxa" w:w="120"/>
@@ -844,13 +698,13 @@
                 <w:sz w:val="20"/>
                 <w:szCs w:val="20"/>
               </w:rPr>
-              <w:t xml:space="preserve">Média</w:t>
-            </w:r>
-          </w:p>
-        </w:tc>
-        <w:tc>
-          <w:tcPr>
-            <w:tcW w:type="dxa" w:w="5160"/>
+              <w:t xml:space="preserve">P2 - Urgente</w:t>
+            </w:r>
+          </w:p>
+        </w:tc>
+        <w:tc>
+          <w:tcPr>
+            <w:tcW w:type="dxa" w:w="4760"/>
             <w:tcBorders>
               <w:top w:val="single" w:color="CCCCCC" w:sz="1"/>
               <w:left w:val="single" w:color="CCCCCC" w:sz="1"/>
@@ -874,7 +728,7 @@
                 <w:sz w:val="20"/>
                 <w:szCs w:val="20"/>
               </w:rPr>
-              <w:t xml:space="preserve">Impacto parcial, com contorno possível.</w:t>
+              <w:t xml:space="preserve">Impacto alto, com contorno difícil.</w:t>
             </w:r>
           </w:p>
         </w:tc>
@@ -904,7 +758,7 @@
                 <w:sz w:val="20"/>
                 <w:szCs w:val="20"/>
               </w:rPr>
-              <w:t xml:space="preserve">16 horas</w:t>
+              <w:t xml:space="preserve">8 horas</w:t>
             </w:r>
           </w:p>
         </w:tc>
@@ -912,14 +766,14 @@
       <w:tr>
         <w:tc>
           <w:tcPr>
-            <w:tcW w:type="dxa" w:w="1800"/>
-            <w:tcBorders>
-              <w:top w:val="single" w:color="CCCCCC" w:sz="1"/>
-              <w:left w:val="single" w:color="CCCCCC" w:sz="1"/>
-              <w:bottom w:val="single" w:color="CCCCCC" w:sz="1"/>
-              <w:right w:val="single" w:color="CCCCCC" w:sz="1"/>
-            </w:tcBorders>
-            <w:shd w:fill="C6E0B4" w:val="clear"/>
+            <w:tcW w:type="dxa" w:w="2200"/>
+            <w:tcBorders>
+              <w:top w:val="single" w:color="CCCCCC" w:sz="1"/>
+              <w:left w:val="single" w:color="CCCCCC" w:sz="1"/>
+              <w:bottom w:val="single" w:color="CCCCCC" w:sz="1"/>
+              <w:right w:val="single" w:color="CCCCCC" w:sz="1"/>
+            </w:tcBorders>
+            <w:shd w:fill="FFE699" w:val="clear"/>
             <w:tcMar>
               <w:top w:type="dxa" w:w="80"/>
               <w:left w:type="dxa" w:w="120"/>
@@ -937,13 +791,13 @@
                 <w:sz w:val="20"/>
                 <w:szCs w:val="20"/>
               </w:rPr>
-              <w:t xml:space="preserve">Baixa</w:t>
-            </w:r>
-          </w:p>
-        </w:tc>
-        <w:tc>
-          <w:tcPr>
-            <w:tcW w:type="dxa" w:w="5160"/>
+              <w:t xml:space="preserve">P3 - Médio</w:t>
+            </w:r>
+          </w:p>
+        </w:tc>
+        <w:tc>
+          <w:tcPr>
+            <w:tcW w:type="dxa" w:w="4760"/>
             <w:tcBorders>
               <w:top w:val="single" w:color="CCCCCC" w:sz="1"/>
               <w:left w:val="single" w:color="CCCCCC" w:sz="1"/>
@@ -967,7 +821,7 @@
                 <w:sz w:val="20"/>
                 <w:szCs w:val="20"/>
               </w:rPr>
-              <w:t xml:space="preserve">Dúvida ou ajuste sem impacto imediato.</w:t>
+              <w:t xml:space="preserve">Impacto parcial, com contorno possível.</w:t>
             </w:r>
           </w:p>
         </w:tc>
@@ -997,12 +851,212 @@
                 <w:sz w:val="20"/>
                 <w:szCs w:val="20"/>
               </w:rPr>
+              <w:t xml:space="preserve">16 horas</w:t>
+            </w:r>
+          </w:p>
+        </w:tc>
+      </w:tr>
+      <w:tr>
+        <w:tc>
+          <w:tcPr>
+            <w:tcW w:type="dxa" w:w="2200"/>
+            <w:tcBorders>
+              <w:top w:val="single" w:color="CCCCCC" w:sz="1"/>
+              <w:left w:val="single" w:color="CCCCCC" w:sz="1"/>
+              <w:bottom w:val="single" w:color="CCCCCC" w:sz="1"/>
+              <w:right w:val="single" w:color="CCCCCC" w:sz="1"/>
+            </w:tcBorders>
+            <w:shd w:fill="C6E0B4" w:val="clear"/>
+            <w:tcMar>
+              <w:top w:type="dxa" w:w="80"/>
+              <w:left w:type="dxa" w:w="120"/>
+              <w:bottom w:type="dxa" w:w="80"/>
+              <w:right w:type="dxa" w:w="120"/>
+            </w:tcMar>
+          </w:tcPr>
+          <w:p>
+            <w:r>
+              <w:rPr>
+                <w:rFonts w:ascii="Arial" w:cs="Arial" w:eastAsia="Arial" w:hAnsi="Arial"/>
+                <w:b/>
+                <w:bCs/>
+                <w:color w:val="000000"/>
+                <w:sz w:val="20"/>
+                <w:szCs w:val="20"/>
+              </w:rPr>
+              <w:t xml:space="preserve">P4 - Leve</w:t>
+            </w:r>
+          </w:p>
+        </w:tc>
+        <w:tc>
+          <w:tcPr>
+            <w:tcW w:type="dxa" w:w="4760"/>
+            <w:tcBorders>
+              <w:top w:val="single" w:color="CCCCCC" w:sz="1"/>
+              <w:left w:val="single" w:color="CCCCCC" w:sz="1"/>
+              <w:bottom w:val="single" w:color="CCCCCC" w:sz="1"/>
+              <w:right w:val="single" w:color="CCCCCC" w:sz="1"/>
+            </w:tcBorders>
+            <w:tcMar>
+              <w:top w:type="dxa" w:w="80"/>
+              <w:left w:type="dxa" w:w="120"/>
+              <w:bottom w:type="dxa" w:w="80"/>
+              <w:right w:type="dxa" w:w="120"/>
+            </w:tcMar>
+          </w:tcPr>
+          <w:p>
+            <w:r>
+              <w:rPr>
+                <w:rFonts w:ascii="Arial" w:cs="Arial" w:eastAsia="Arial" w:hAnsi="Arial"/>
+                <w:b w:val="false"/>
+                <w:bCs w:val="false"/>
+                <w:color w:val="000000"/>
+                <w:sz w:val="20"/>
+                <w:szCs w:val="20"/>
+              </w:rPr>
+              <w:t xml:space="preserve">Dúvida ou ajuste sem impacto imediato.</w:t>
+            </w:r>
+          </w:p>
+        </w:tc>
+        <w:tc>
+          <w:tcPr>
+            <w:tcW w:type="dxa" w:w="2400"/>
+            <w:tcBorders>
+              <w:top w:val="single" w:color="CCCCCC" w:sz="1"/>
+              <w:left w:val="single" w:color="CCCCCC" w:sz="1"/>
+              <w:bottom w:val="single" w:color="CCCCCC" w:sz="1"/>
+              <w:right w:val="single" w:color="CCCCCC" w:sz="1"/>
+            </w:tcBorders>
+            <w:tcMar>
+              <w:top w:type="dxa" w:w="80"/>
+              <w:left w:type="dxa" w:w="120"/>
+              <w:bottom w:type="dxa" w:w="80"/>
+              <w:right w:type="dxa" w:w="120"/>
+            </w:tcMar>
+          </w:tcPr>
+          <w:p>
+            <w:r>
+              <w:rPr>
+                <w:rFonts w:ascii="Arial" w:cs="Arial" w:eastAsia="Arial" w:hAnsi="Arial"/>
+                <w:b w:val="false"/>
+                <w:bCs w:val="false"/>
+                <w:color w:val="000000"/>
+                <w:sz w:val="20"/>
+                <w:szCs w:val="20"/>
+              </w:rPr>
               <w:t xml:space="preserve">24 horas</w:t>
             </w:r>
           </w:p>
         </w:tc>
       </w:tr>
     </w:tbl>
+    <w:p>
+      <w:pPr>
+        <w:pStyle w:val="Heading1"/>
+      </w:pPr>
+      <w:r>
+        <w:t xml:space="preserve">6. Abertura de chamado no ServiceToday</w:t>
+      </w:r>
+    </w:p>
+    <w:p>
+      <w:pPr>
+        <w:spacing w:after="120"/>
+        <w:jc w:val="both"/>
+      </w:pPr>
+      <w:r>
+        <w:rPr>
+          <w:rFonts w:ascii="Arial" w:cs="Arial" w:eastAsia="Arial" w:hAnsi="Arial"/>
+          <w:sz w:val="22"/>
+          <w:szCs w:val="22"/>
+        </w:rPr>
+        <w:t xml:space="preserve">Após a confirmação do usuário, o chamado é registrado com os dados coletados:</w:t>
+      </w:r>
+    </w:p>
+    <w:p>
+      <w:pPr>
+        <w:pStyle w:val="ListParagraph"/>
+        <w:numPr>
+          <w:ilvl w:val="0"/>
+          <w:numId w:val="3"/>
+        </w:numPr>
+      </w:pPr>
+      <w:r>
+        <w:rPr>
+          <w:rFonts w:ascii="Arial" w:cs="Arial" w:eastAsia="Arial" w:hAnsi="Arial"/>
+          <w:sz w:val="22"/>
+          <w:szCs w:val="22"/>
+        </w:rPr>
+        <w:t xml:space="preserve">Ferramenta de destino: SAP ou MES.</w:t>
+      </w:r>
+    </w:p>
+    <w:p>
+      <w:pPr>
+        <w:pStyle w:val="ListParagraph"/>
+        <w:numPr>
+          <w:ilvl w:val="0"/>
+          <w:numId w:val="3"/>
+        </w:numPr>
+      </w:pPr>
+      <w:r>
+        <w:rPr>
+          <w:rFonts w:ascii="Arial" w:cs="Arial" w:eastAsia="Arial" w:hAnsi="Arial"/>
+          <w:sz w:val="22"/>
+          <w:szCs w:val="22"/>
+        </w:rPr>
+        <w:t xml:space="preserve">Módulo (detectado automaticamente): SAP MM, PP, QM, WM ou Integração/MES.</w:t>
+      </w:r>
+    </w:p>
+    <w:p>
+      <w:pPr>
+        <w:pStyle w:val="ListParagraph"/>
+        <w:numPr>
+          <w:ilvl w:val="0"/>
+          <w:numId w:val="3"/>
+        </w:numPr>
+      </w:pPr>
+      <w:r>
+        <w:rPr>
+          <w:rFonts w:ascii="Arial" w:cs="Arial" w:eastAsia="Arial" w:hAnsi="Arial"/>
+          <w:sz w:val="22"/>
+          <w:szCs w:val="22"/>
+        </w:rPr>
+        <w:t xml:space="preserve">Sistema afetado: ECC ou S/4HANA.</w:t>
+      </w:r>
+    </w:p>
+    <w:p>
+      <w:pPr>
+        <w:pStyle w:val="ListParagraph"/>
+        <w:numPr>
+          <w:ilvl w:val="0"/>
+          <w:numId w:val="3"/>
+        </w:numPr>
+      </w:pPr>
+      <w:r>
+        <w:rPr>
+          <w:rFonts w:ascii="Arial" w:cs="Arial" w:eastAsia="Arial" w:hAnsi="Arial"/>
+          <w:sz w:val="22"/>
+          <w:szCs w:val="22"/>
+        </w:rPr>
+        <w:t xml:space="preserve">Descrição, transação, número do documento e prints.</w:t>
+      </w:r>
+    </w:p>
+    <w:p>
+      <w:pPr>
+        <w:pStyle w:val="ListParagraph"/>
+        <w:numPr>
+          <w:ilvl w:val="0"/>
+          <w:numId w:val="3"/>
+        </w:numPr>
+      </w:pPr>
+      <w:r>
+        <w:rPr>
+          <w:rFonts w:ascii="Arial" w:cs="Arial" w:eastAsia="Arial" w:hAnsi="Arial"/>
+          <w:sz w:val="22"/>
+          <w:szCs w:val="22"/>
+        </w:rPr>
+        <w:t xml:space="preserve">Prioridade (P1 a P4) e número sequencial único (INC00XXXXX).</w:t>
+      </w:r>
+    </w:p>
     <w:p>
       <w:pPr>
         <w:pStyle w:val="Heading1"/>
@@ -1151,7 +1205,7 @@
                 <w:sz w:val="20"/>
                 <w:szCs w:val="20"/>
               </w:rPr>
-              <w:t xml:space="preserve">Compras, estoques, faturas, mestre de materiais (foco principal).</w:t>
+              <w:t xml:space="preserve">Compras, estoques, faturas, mestre de materiais (foco).</w:t>
             </w:r>
           </w:p>
         </w:tc>
@@ -1461,7 +1515,7 @@
                 <w:sz w:val="20"/>
                 <w:szCs w:val="20"/>
               </w:rPr>
-              <w:t xml:space="preserve">Acessos, autorizações e questões técnicas de sistema.</w:t>
+              <w:t xml:space="preserve">Acessos, autorizações e questões técnicas.</w:t>
             </w:r>
           </w:p>
         </w:tc>
@@ -1472,7 +1526,7 @@
         <w:pStyle w:val="Heading1"/>
       </w:pPr>
       <w:r>
-        <w:t xml:space="preserve">8. Boas práticas ao solicitar suporte</w:t>
+        <w:t xml:space="preserve">8. Boas práticas</w:t>
       </w:r>
     </w:p>
     <w:p>
@@ -1489,7 +1543,7 @@
           <w:sz w:val="22"/>
           <w:szCs w:val="22"/>
         </w:rPr>
-        <w:t xml:space="preserve">Descreva o problema de forma objetiva, com o passo a passo para reproduzi-lo.</w:t>
+        <w:t xml:space="preserve">Descreva o problema de forma objetiva, com passo a passo para reproduzi-lo.</w:t>
       </w:r>
     </w:p>
     <w:p>
@@ -1506,7 +1560,7 @@
           <w:sz w:val="22"/>
           <w:szCs w:val="22"/>
         </w:rPr>
-        <w:t xml:space="preserve">Sempre informe a transação, o número do documento e o sistema (ECC ou S/4HANA).</w:t>
+        <w:t xml:space="preserve">Informe a transação, o número do documento e o sistema (ECC ou S/4HANA).</w:t>
       </w:r>
     </w:p>
     <w:p>
@@ -1557,7 +1611,7 @@
           <w:sz w:val="22"/>
           <w:szCs w:val="22"/>
         </w:rPr>
-        <w:t xml:space="preserve">Consulte antes a base de conhecimento e o agente de IA; muitos casos já têm solução documentada.</w:t>
+        <w:t xml:space="preserve">Consulte antes o agente de IA; muitos casos já têm solução documentada.</w:t>
       </w:r>
     </w:p>
     <w:p>
@@ -1579,7 +1633,7 @@
           <w:sz w:val="22"/>
           <w:szCs w:val="22"/>
         </w:rPr>
-        <w:t xml:space="preserve">Este manual deve ser revisado periodicamente pelo time de suporte SAP da Orla_Tech. Novos incidentes recorrentes e suas soluções devem ser incorporados à base de conhecimento para melhorar continuamente as respostas do agente de IA.</w:t>
+        <w:t xml:space="preserve">Revisado periodicamente pelo time de suporte SAP da Orla_Tech. Novos incidentes recorrentes e suas soluções devem ser incorporados à base de conhecimento para melhorar continuamente o agente.</w:t>
       </w:r>
     </w:p>
     <w:sectPr>

</xml_diff>